<commit_message>
feat: actualización general del sistema RED-SALUD-DISTRIBUIDA
- Actualización del backend (main.py): mejoras en lógica de nodos P2P y endpoints FHIR con JWT
- Actualización del frontend (App.js): mejoras en panel de control de nodos y módulos clínicos
- Actualización docker-compose.yml: configuración de servicios y healthchecks
- Actualización Paper_IEEE_RedSaludDistribuida.docx: versión actualizada del paper
- Actualización prometheus/prometheus.yml: configuración de monitoreo
- Agrega referencias técnicas (ref-citus, ref-fhir, ref-hist, ref-minikube, reference-repo)
- Agrega package-lock.json
- Elimina archivos obsoletos (Plantilla_IEEE, requisitos_parcial.csv)
</commit_message>
<xml_diff>
--- a/Paper_IEEE_RedSaludDistribuida.docx
+++ b/Paper_IEEE_RedSaludDistribuida.docx
@@ -260,11 +260,11 @@
         <w:t>La metodología sigue un diseño experimental de ingeniería de sistemas. Se implementó un stack Docker Compose con los siguientes componentes:</w:t>
         <w:br/>
         <w:br/>
-        <w:t>• 3 nodos API Flask (puertos 5000–5002) representando nodos geográficos.</w:t>
+        <w:t>• 4 nodos API Flask (puertos 5000–5003) representando nodos geográficos.</w:t>
         <w:br/>
-        <w:t>• 3 instancias HAPI FHIR R4 (puertos 8080–8082) por nodo.</w:t>
+        <w:t>• 3 instancias HAPI FHIR R4 (puertos 8080–8082) en total.</w:t>
         <w:br/>
-        <w:t>• 3 instancias CouchDB (puertos 5984–5986) para almacenamiento documental.</w:t>
+        <w:t>• 4 instancias CouchDB (puertos 5984–5987) para almacenamiento documental.</w:t>
         <w:br/>
         <w:t>• 1 coordinador Citus + 2 workers (puerto 5432) para el esquema relacional.</w:t>
         <w:br/>

</xml_diff>